<commit_message>
LEEDS evidence: home without Latest-results banner; model description with stylised features
Co-Authored-By: Claude Opus 5.5 <noreply@anthropic.com>
Claude-Session: https://claude.ai/code/session_01UEf7G2CEAvaNHwiT5mSLT5
</commit_message>
<xml_diff>
--- a/projects/leeds_model/evidence/evidence/output/html/appendices/2026-10-13-model-description-current-revised.docx
+++ b/projects/leeds_model/evidence/evidence/output/html/appendices/2026-10-13-model-description-current-revised.docx
@@ -404,7 +404,1209 @@
         </w:tc>
       </w:tr>
     </w:tbl>
-    <w:bookmarkStart w:id="23" w:name="introduction"/>
+    <w:bookmarkStart w:id="23" w:name="X1eaede22c91706a91998b59c613b1c136276421"/>
+    <w:p>
+      <w:pPr>
+        <w:pStyle w:val="Heading1"/>
+      </w:pPr>
+      <w:r>
+        <w:t xml:space="preserve">The model at a glance: its stylised features</w:t>
+      </w:r>
+    </w:p>
+    <w:p>
+      <w:pPr>
+        <w:pStyle w:val="FirstParagraph"/>
+      </w:pPr>
+      <w:r>
+        <w:t xml:space="preserve">What the model is, feature by feature, with the block where each is specified. The next section</w:t>
+      </w:r>
+      <w:r>
+        <w:t xml:space="preserve"> </w:t>
+      </w:r>
+      <w:r>
+        <w:t xml:space="preserve">says how it differs from the submitted model.</w:t>
+      </w:r>
+    </w:p>
+    <w:p>
+      <w:pPr>
+        <w:pStyle w:val="BodyText"/>
+      </w:pPr>
+      <w:r>
+        <w:rPr>
+          <w:b/>
+          <w:bCs/>
+        </w:rPr>
+        <w:t xml:space="preserve">Structure</w:t>
+      </w:r>
+    </w:p>
+    <w:p>
+      <w:pPr>
+        <w:pStyle w:val="Compact"/>
+        <w:numPr>
+          <w:ilvl w:val="0"/>
+          <w:numId w:val="1001"/>
+        </w:numPr>
+      </w:pPr>
+      <w:r>
+        <w:rPr>
+          <w:b/>
+          <w:bCs/>
+        </w:rPr>
+        <w:t xml:space="preserve">Two regions, 54 industries each.</w:t>
+      </w:r>
+      <w:r>
+        <w:t xml:space="preserve"> </w:t>
+      </w:r>
+      <w:r>
+        <w:t xml:space="preserve">The A matrix is 108 × 108, built from EXIOBASE 3.8.2</w:t>
+      </w:r>
+      <w:r>
+        <w:t xml:space="preserve"> </w:t>
+      </w:r>
+      <w:r>
+        <w:t xml:space="preserve">(industry by industry, 2011). The regional split is not hard-wired: the workbook pipeline</w:t>
+      </w:r>
+      <w:r>
+        <w:t xml:space="preserve"> </w:t>
+      </w:r>
+      <w:r>
+        <w:t xml:space="preserve">(</w:t>
+      </w:r>
+      <w:r>
+        <w:rPr>
+          <w:rStyle w:val="VerbatimChar"/>
+        </w:rPr>
+        <w:t xml:space="preserve">tools/exiobase/exio_mrio_aggregate.py</w:t>
+      </w:r>
+      <w:r>
+        <w:t xml:space="preserve">) aggregates the raw EXIOBASE files onto the 54 industries</w:t>
+      </w:r>
+      <w:r>
+        <w:t xml:space="preserve"> </w:t>
+      </w:r>
+      <w:r>
+        <w:t xml:space="preserve">under any two-region concordance given as a CSV. That is how both setups of the Results were built,</w:t>
+      </w:r>
+      <w:r>
+        <w:t xml:space="preserve"> </w:t>
+      </w:r>
+      <w:r>
+        <w:t xml:space="preserve">EU/RoW and North/South. The 54-industry aggregation itself is fixed by</w:t>
+      </w:r>
+      <w:r>
+        <w:t xml:space="preserve"> </w:t>
+      </w:r>
+      <w:r>
+        <w:rPr>
+          <w:rStyle w:val="VerbatimChar"/>
+        </w:rPr>
+        <w:t xml:space="preserve">data/exiobase/exiobase_sector_concordance.csv</w:t>
+      </w:r>
+      <w:r>
+        <w:t xml:space="preserve">.</w:t>
+      </w:r>
+    </w:p>
+    <w:p>
+      <w:pPr>
+        <w:pStyle w:val="Compact"/>
+        <w:numPr>
+          <w:ilvl w:val="0"/>
+          <w:numId w:val="1001"/>
+        </w:numPr>
+      </w:pPr>
+      <w:r>
+        <w:rPr>
+          <w:b/>
+          <w:bCs/>
+        </w:rPr>
+        <w:t xml:space="preserve">Stock-flow consistent.</w:t>
+      </w:r>
+      <w:r>
+        <w:t xml:space="preserve"> </w:t>
+      </w:r>
+      <w:r>
+        <w:t xml:space="preserve">Every flow is a change in some sector’s balance sheet.</w:t>
+      </w:r>
+    </w:p>
+    <w:p>
+      <w:pPr>
+        <w:pStyle w:val="Compact"/>
+        <w:numPr>
+          <w:ilvl w:val="0"/>
+          <w:numId w:val="1001"/>
+        </w:numPr>
+      </w:pPr>
+      <w:r>
+        <w:rPr>
+          <w:b/>
+          <w:bCs/>
+        </w:rPr>
+        <w:t xml:space="preserve">Annual periods.</w:t>
+      </w:r>
+      <w:r>
+        <w:t xml:space="preserve"> </w:t>
+      </w:r>
+      <w:r>
+        <w:t xml:space="preserve">Before t = 1 the model runs 60 unshocked spin-up periods. Interventions start</w:t>
+      </w:r>
+      <w:r>
+        <w:t xml:space="preserve"> </w:t>
+      </w:r>
+      <w:r>
+        <w:t xml:space="preserve">at t = 70, and the Results read period 90 against the same arm’s unshocked baseline.</w:t>
+      </w:r>
+    </w:p>
+    <w:p>
+      <w:pPr>
+        <w:pStyle w:val="FirstParagraph"/>
+      </w:pPr>
+      <w:r>
+        <w:rPr>
+          <w:b/>
+          <w:bCs/>
+        </w:rPr>
+        <w:t xml:space="preserve">Prices and distribution</w:t>
+      </w:r>
+      <w:r>
+        <w:t xml:space="preserve"> </w:t>
+      </w:r>
+      <w:r>
+        <w:t xml:space="preserve">(Block 8)</w:t>
+      </w:r>
+    </w:p>
+    <w:p>
+      <w:pPr>
+        <w:pStyle w:val="Compact"/>
+        <w:numPr>
+          <w:ilvl w:val="0"/>
+          <w:numId w:val="1002"/>
+        </w:numPr>
+      </w:pPr>
+      <w:r>
+        <w:rPr>
+          <w:b/>
+          <w:bCs/>
+        </w:rPr>
+        <w:t xml:space="preserve">Sraffian prices of production.</w:t>
+      </w:r>
+      <w:r>
+        <w:t xml:space="preserve"> </w:t>
+      </w:r>
+      <w:r>
+        <w:t xml:space="preserve">One uniform rate of profit applies to the circulating and fixed</w:t>
+      </w:r>
+      <w:r>
+        <w:t xml:space="preserve"> </w:t>
+      </w:r>
+      <w:r>
+        <w:t xml:space="preserve">capital advanced: p = (1 + r) p Ξ(A + K) + w l. Ξ values imported inputs at the exchange rate and</w:t>
+      </w:r>
+      <w:r>
+        <w:t xml:space="preserve"> </w:t>
+      </w:r>
+      <w:r>
+        <w:t xml:space="preserve">the duty they bear.</w:t>
+      </w:r>
+    </w:p>
+    <w:p>
+      <w:pPr>
+        <w:pStyle w:val="Compact"/>
+        <w:numPr>
+          <w:ilvl w:val="0"/>
+          <w:numId w:val="1002"/>
+        </w:numPr>
+      </w:pPr>
+      <w:r>
+        <w:rPr>
+          <w:b/>
+          <w:bCs/>
+        </w:rPr>
+        <w:t xml:space="preserve">The Sraffa–Pivetti closure.</w:t>
+      </w:r>
+      <w:r>
+        <w:t xml:space="preserve"> </w:t>
+      </w:r>
+      <w:r>
+        <w:t xml:space="preserve">The rate of profit is the money rate of interest plus a normal</w:t>
+      </w:r>
+      <w:r>
+        <w:t xml:space="preserve"> </w:t>
+      </w:r>
+      <w:r>
+        <w:t xml:space="preserve">profit of enterprise, r = r_b + e. Distribution is therefore set by the monetary authority, not by</w:t>
+      </w:r>
+      <w:r>
+        <w:t xml:space="preserve"> </w:t>
+      </w:r>
+      <w:r>
+        <w:t xml:space="preserve">the mark-ups of 108 industries. e = 0.2222 is derived, not fitted: it is the value at which the</w:t>
+      </w:r>
+      <w:r>
+        <w:t xml:space="preserve"> </w:t>
+      </w:r>
+      <w:r>
+        <w:t xml:space="preserve">prices of production reproduce the observed 2011 price level.</w:t>
+      </w:r>
+    </w:p>
+    <w:p>
+      <w:pPr>
+        <w:pStyle w:val="Compact"/>
+        <w:numPr>
+          <w:ilvl w:val="0"/>
+          <w:numId w:val="1002"/>
+        </w:numPr>
+      </w:pPr>
+      <w:r>
+        <w:rPr>
+          <w:b/>
+          <w:bCs/>
+        </w:rPr>
+        <w:t xml:space="preserve">A money wage anchored at its 2011 regional mean.</w:t>
+      </w:r>
+      <w:r>
+        <w:t xml:space="preserve"> </w:t>
+      </w:r>
+      <w:r>
+        <w:t xml:space="preserve">The price level is therefore determinate.</w:t>
+      </w:r>
+    </w:p>
+    <w:p>
+      <w:pPr>
+        <w:pStyle w:val="Compact"/>
+        <w:numPr>
+          <w:ilvl w:val="0"/>
+          <w:numId w:val="1002"/>
+        </w:numPr>
+      </w:pPr>
+      <w:r>
+        <w:rPr>
+          <w:b/>
+          <w:bCs/>
+        </w:rPr>
+        <w:t xml:space="preserve">A standard commodity.</w:t>
+      </w:r>
+      <w:r>
+        <w:t xml:space="preserve"> </w:t>
+      </w:r>
+      <w:r>
+        <w:t xml:space="preserve">R_max and the standard commodity are computed every period, and the</w:t>
+      </w:r>
+      <w:r>
+        <w:t xml:space="preserve"> </w:t>
+      </w:r>
+      <w:r>
+        <w:t xml:space="preserve">standard commodity serves as the measure of prices.</w:t>
+      </w:r>
+    </w:p>
+    <w:p>
+      <w:pPr>
+        <w:pStyle w:val="FirstParagraph"/>
+      </w:pPr>
+      <w:r>
+        <w:rPr>
+          <w:b/>
+          <w:bCs/>
+        </w:rPr>
+        <w:t xml:space="preserve">Households and labour</w:t>
+      </w:r>
+      <w:r>
+        <w:t xml:space="preserve"> </w:t>
+      </w:r>
+      <w:r>
+        <w:t xml:space="preserve">(Blocks 1, 6)</w:t>
+      </w:r>
+    </w:p>
+    <w:p>
+      <w:pPr>
+        <w:pStyle w:val="Compact"/>
+        <w:numPr>
+          <w:ilvl w:val="0"/>
+          <w:numId w:val="1003"/>
+        </w:numPr>
+      </w:pPr>
+      <w:r>
+        <w:rPr>
+          <w:b/>
+          <w:bCs/>
+        </w:rPr>
+        <w:t xml:space="preserve">Two classes.</w:t>
+      </w:r>
+      <w:r>
+        <w:t xml:space="preserve"> </w:t>
+      </w:r>
+      <w:r>
+        <w:t xml:space="preserve">Workers and capitalists receive separate disposable incomes. Consumption has</w:t>
+      </w:r>
+      <w:r>
+        <w:t xml:space="preserve"> </w:t>
+      </w:r>
+      <w:r>
+        <w:t xml:space="preserve">separate propensities out of wage income, out of capital income and out of net wealth.</w:t>
+      </w:r>
+    </w:p>
+    <w:p>
+      <w:pPr>
+        <w:pStyle w:val="Compact"/>
+        <w:numPr>
+          <w:ilvl w:val="0"/>
+          <w:numId w:val="1003"/>
+        </w:numPr>
+      </w:pPr>
+      <w:r>
+        <w:rPr>
+          <w:b/>
+          <w:bCs/>
+        </w:rPr>
+        <w:t xml:space="preserve">Employment from labour coefficients.</w:t>
+      </w:r>
+      <w:r>
+        <w:t xml:space="preserve"> </w:t>
+      </w:r>
+      <w:r>
+        <w:t xml:space="preserve">Female employment is tracked alongside total employment.</w:t>
+      </w:r>
+    </w:p>
+    <w:p>
+      <w:pPr>
+        <w:pStyle w:val="FirstParagraph"/>
+      </w:pPr>
+      <w:r>
+        <w:rPr>
+          <w:b/>
+          <w:bCs/>
+        </w:rPr>
+        <w:t xml:space="preserve">Production and capital</w:t>
+      </w:r>
+      <w:r>
+        <w:t xml:space="preserve"> </w:t>
+      </w:r>
+      <w:r>
+        <w:t xml:space="preserve">(Blocks 2, 3, 13)</w:t>
+      </w:r>
+    </w:p>
+    <w:p>
+      <w:pPr>
+        <w:pStyle w:val="Compact"/>
+        <w:numPr>
+          <w:ilvl w:val="0"/>
+          <w:numId w:val="1004"/>
+        </w:numPr>
+      </w:pPr>
+      <w:r>
+        <w:rPr>
+          <w:b/>
+          <w:bCs/>
+        </w:rPr>
+        <w:t xml:space="preserve">Leontief quantities.</w:t>
+      </w:r>
+      <w:r>
+        <w:t xml:space="preserve"> </w:t>
+      </w:r>
+      <w:r>
+        <w:t xml:space="preserve">Output is the Leontief inverse applied to final demand.</w:t>
+      </w:r>
+    </w:p>
+    <w:p>
+      <w:pPr>
+        <w:pStyle w:val="Compact"/>
+        <w:numPr>
+          <w:ilvl w:val="0"/>
+          <w:numId w:val="1004"/>
+        </w:numPr>
+      </w:pPr>
+      <w:r>
+        <w:rPr>
+          <w:b/>
+          <w:bCs/>
+        </w:rPr>
+        <w:t xml:space="preserve">Replacement from data.</w:t>
+      </w:r>
+      <w:r>
+        <w:t xml:space="preserve"> </w:t>
+      </w:r>
+      <w:r>
+        <w:t xml:space="preserve">An empirical capital-flow matrix K (EXIOBASE 2011) gives what each</w:t>
+      </w:r>
+      <w:r>
+        <w:t xml:space="preserve"> </w:t>
+      </w:r>
+      <w:r>
+        <w:t xml:space="preserve">industry’s depreciation consists of, by product and by origin.</w:t>
+      </w:r>
+    </w:p>
+    <w:p>
+      <w:pPr>
+        <w:pStyle w:val="Compact"/>
+        <w:numPr>
+          <w:ilvl w:val="0"/>
+          <w:numId w:val="1004"/>
+        </w:numPr>
+      </w:pPr>
+      <w:r>
+        <w:rPr>
+          <w:b/>
+          <w:bCs/>
+        </w:rPr>
+        <w:t xml:space="preserve">Capital stocks from data.</w:t>
+      </w:r>
+      <w:r>
+        <w:t xml:space="preserve"> </w:t>
+      </w:r>
+      <w:r>
+        <w:t xml:space="preserve">The target capital–output ratio is κ_j = d_j/δ_j, with depreciation</w:t>
+      </w:r>
+      <w:r>
+        <w:t xml:space="preserve"> </w:t>
+      </w:r>
+      <w:r>
+        <w:t xml:space="preserve">rates δ_j from Eurostat.</w:t>
+      </w:r>
+    </w:p>
+    <w:p>
+      <w:pPr>
+        <w:pStyle w:val="Compact"/>
+        <w:numPr>
+          <w:ilvl w:val="0"/>
+          <w:numId w:val="1004"/>
+        </w:numPr>
+      </w:pPr>
+      <w:r>
+        <w:rPr>
+          <w:b/>
+          <w:bCs/>
+        </w:rPr>
+        <w:t xml:space="preserve">A flexible accelerator.</w:t>
+      </w:r>
+      <w:r>
+        <w:t xml:space="preserve"> </w:t>
+      </w:r>
+      <w:r>
+        <w:t xml:space="preserve">Investment closes the gap to the capital target at speed γ = 0.15, plus</w:t>
+      </w:r>
+      <w:r>
+        <w:t xml:space="preserve"> </w:t>
+      </w:r>
+      <w:r>
+        <w:t xml:space="preserve">replacement. Public investment follows its own accelerator towards a target public capital stock.</w:t>
+      </w:r>
+    </w:p>
+    <w:p>
+      <w:pPr>
+        <w:pStyle w:val="Compact"/>
+        <w:numPr>
+          <w:ilvl w:val="0"/>
+          <w:numId w:val="1004"/>
+        </w:numPr>
+      </w:pPr>
+      <w:r>
+        <w:rPr>
+          <w:b/>
+          <w:bCs/>
+        </w:rPr>
+        <w:t xml:space="preserve">Circular-economy interventions as technical change.</w:t>
+      </w:r>
+      <w:r>
+        <w:t xml:space="preserve"> </w:t>
+      </w:r>
+      <w:r>
+        <w:t xml:space="preserve">A scenario changes either the technical</w:t>
+      </w:r>
+      <w:r>
+        <w:t xml:space="preserve"> </w:t>
+      </w:r>
+      <w:r>
+        <w:t xml:space="preserve">coefficients a_ij (the technology) or the composition of final demand. The speed of innovation</w:t>
+      </w:r>
+      <w:r>
+        <w:t xml:space="preserve"> </w:t>
+      </w:r>
+      <w:r>
+        <w:t xml:space="preserve">rises with government spending.</w:t>
+      </w:r>
+    </w:p>
+    <w:p>
+      <w:pPr>
+        <w:pStyle w:val="FirstParagraph"/>
+      </w:pPr>
+      <w:r>
+        <w:rPr>
+          <w:b/>
+          <w:bCs/>
+        </w:rPr>
+        <w:t xml:space="preserve">Finance</w:t>
+      </w:r>
+      <w:r>
+        <w:t xml:space="preserve"> </w:t>
+      </w:r>
+      <w:r>
+        <w:t xml:space="preserve">(Blocks 3, 4, 7)</w:t>
+      </w:r>
+    </w:p>
+    <w:p>
+      <w:pPr>
+        <w:pStyle w:val="Compact"/>
+        <w:numPr>
+          <w:ilvl w:val="0"/>
+          <w:numId w:val="1005"/>
+        </w:numPr>
+      </w:pPr>
+      <w:r>
+        <w:rPr>
+          <w:b/>
+          <w:bCs/>
+        </w:rPr>
+        <w:t xml:space="preserve">Firms have zero net worth.</w:t>
+      </w:r>
+      <w:r>
+        <w:t xml:space="preserve"> </w:t>
+      </w:r>
+      <w:r>
+        <w:t xml:space="preserve">Firm loans and equity together finance the capital stock,</w:t>
+      </w:r>
+      <w:r>
+        <w:t xml:space="preserve"> </w:t>
+      </w:r>
+      <w:r>
+        <w:t xml:space="preserve">L_F + e_s = p_I k. Loans are the residual, so leverage is set by households’ portfolio choice.</w:t>
+      </w:r>
+    </w:p>
+    <w:p>
+      <w:pPr>
+        <w:pStyle w:val="Compact"/>
+        <w:numPr>
+          <w:ilvl w:val="0"/>
+          <w:numId w:val="1005"/>
+        </w:numPr>
+      </w:pPr>
+      <w:r>
+        <w:rPr>
+          <w:b/>
+          <w:bCs/>
+        </w:rPr>
+        <w:t xml:space="preserve">A Tobin portfolio block.</w:t>
+      </w:r>
+      <w:r>
+        <w:t xml:space="preserve"> </w:t>
+      </w:r>
+      <w:r>
+        <w:t xml:space="preserve">Households hold domestic and foreign bills, domestic and foreign</w:t>
+      </w:r>
+      <w:r>
+        <w:t xml:space="preserve"> </w:t>
+      </w:r>
+      <w:r>
+        <w:t xml:space="preserve">equity, and deposits. The shares respond to relative expected returns through a substitution</w:t>
+      </w:r>
+      <w:r>
+        <w:t xml:space="preserve"> </w:t>
+      </w:r>
+      <w:r>
+        <w:t xml:space="preserve">matrix whose rows and columns sum to zero, so the shares always add to one. Expected returns are</w:t>
+      </w:r>
+      <w:r>
+        <w:t xml:space="preserve"> </w:t>
+      </w:r>
+      <w:r>
+        <w:t xml:space="preserve">adaptive, with scale σ = 4. Foreign assets carry the realised currency gain.</w:t>
+      </w:r>
+    </w:p>
+    <w:p>
+      <w:pPr>
+        <w:pStyle w:val="Compact"/>
+        <w:numPr>
+          <w:ilvl w:val="0"/>
+          <w:numId w:val="1005"/>
+        </w:numPr>
+      </w:pPr>
+      <w:r>
+        <w:rPr>
+          <w:b/>
+          <w:bCs/>
+        </w:rPr>
+        <w:t xml:space="preserve">Investment depends on finance.</w:t>
+      </w:r>
+      <w:r>
+        <w:t xml:space="preserve"> </w:t>
+      </w:r>
+      <w:r>
+        <w:t xml:space="preserve">The capital target responds to the margin of the profit rate</w:t>
+      </w:r>
+      <w:r>
+        <w:t xml:space="preserve"> </w:t>
+      </w:r>
+      <w:r>
+        <w:t xml:space="preserve">over the loan rate, and to leverage. Retained profit finances part of net investment. The region</w:t>
+      </w:r>
+      <w:r>
+        <w:t xml:space="preserve"> </w:t>
+      </w:r>
+      <w:r>
+        <w:t xml:space="preserve">whose central bank holds reserves pays a premium on the foreign liabilities a scenario creates.</w:t>
+      </w:r>
+    </w:p>
+    <w:p>
+      <w:pPr>
+        <w:pStyle w:val="Compact"/>
+        <w:numPr>
+          <w:ilvl w:val="0"/>
+          <w:numId w:val="1005"/>
+        </w:numPr>
+      </w:pPr>
+      <w:r>
+        <w:rPr>
+          <w:b/>
+          <w:bCs/>
+        </w:rPr>
+        <w:t xml:space="preserve">Credit rationing.</w:t>
+      </w:r>
+      <w:r>
+        <w:t xml:space="preserve"> </w:t>
+      </w:r>
+      <w:r>
+        <w:t xml:space="preserve">Banks refuse a share of the</w:t>
+      </w:r>
+      <w:r>
+        <w:t xml:space="preserve"> </w:t>
+      </w:r>
+      <w:r>
+        <w:rPr>
+          <w:i/>
+          <w:iCs/>
+        </w:rPr>
+        <w:t xml:space="preserve">additional</w:t>
+      </w:r>
+      <w:r>
+        <w:t xml:space="preserve"> </w:t>
+      </w:r>
+      <w:r>
+        <w:t xml:space="preserve">loans a scenario makes firms ask</w:t>
+      </w:r>
+      <w:r>
+        <w:t xml:space="preserve"> </w:t>
+      </w:r>
+      <w:r>
+        <w:t xml:space="preserve">for, and the refused part is investment that does not happen. The refused share rises with</w:t>
+      </w:r>
+      <w:r>
+        <w:t xml:space="preserve"> </w:t>
+      </w:r>
+      <w:r>
+        <w:t xml:space="preserve">leverage above the unshocked path.</w:t>
+      </w:r>
+    </w:p>
+    <w:p>
+      <w:pPr>
+        <w:pStyle w:val="Compact"/>
+        <w:numPr>
+          <w:ilvl w:val="0"/>
+          <w:numId w:val="1005"/>
+        </w:numPr>
+      </w:pPr>
+      <w:r>
+        <w:rPr>
+          <w:b/>
+          <w:bCs/>
+        </w:rPr>
+        <w:t xml:space="preserve">Endogenous money.</w:t>
+      </w:r>
+      <w:r>
+        <w:t xml:space="preserve"> </w:t>
+      </w:r>
+      <w:r>
+        <w:t xml:space="preserve">Banks supply loans and deposits on demand, hold government bills as a share</w:t>
+      </w:r>
+      <w:r>
+        <w:t xml:space="preserve"> </w:t>
+      </w:r>
+      <w:r>
+        <w:t xml:space="preserve">of deposits, and settle with the central bank.</w:t>
+      </w:r>
+    </w:p>
+    <w:p>
+      <w:pPr>
+        <w:pStyle w:val="FirstParagraph"/>
+      </w:pPr>
+      <w:r>
+        <w:t xml:space="preserve">These finance and credit terms are all measured against the arm’s own unshocked path. They are</w:t>
+      </w:r>
+      <w:r>
+        <w:t xml:space="preserve"> </w:t>
+      </w:r>
+      <w:r>
+        <w:t xml:space="preserve">therefore zero in the baseline and act only on what an intervention changes.</w:t>
+      </w:r>
+    </w:p>
+    <w:p>
+      <w:pPr>
+        <w:pStyle w:val="BodyText"/>
+      </w:pPr>
+      <w:r>
+        <w:rPr>
+          <w:b/>
+          <w:bCs/>
+        </w:rPr>
+        <w:t xml:space="preserve">Government, taxes and trade</w:t>
+      </w:r>
+      <w:r>
+        <w:t xml:space="preserve"> </w:t>
+      </w:r>
+      <w:r>
+        <w:t xml:space="preserve">(Blocks 5, 9)</w:t>
+      </w:r>
+    </w:p>
+    <w:p>
+      <w:pPr>
+        <w:pStyle w:val="Compact"/>
+        <w:numPr>
+          <w:ilvl w:val="0"/>
+          <w:numId w:val="1006"/>
+        </w:numPr>
+      </w:pPr>
+      <w:r>
+        <w:rPr>
+          <w:b/>
+          <w:bCs/>
+        </w:rPr>
+        <w:t xml:space="preserve">VAT on household consumption</w:t>
+      </w:r>
+      <w:r>
+        <w:t xml:space="preserve">, charged by the consuming region at its own rates on domestic and</w:t>
+      </w:r>
+      <w:r>
+        <w:t xml:space="preserve"> </w:t>
+      </w:r>
+      <w:r>
+        <w:t xml:space="preserve">imported goods alike.</w:t>
+      </w:r>
+    </w:p>
+    <w:p>
+      <w:pPr>
+        <w:pStyle w:val="Compact"/>
+        <w:numPr>
+          <w:ilvl w:val="0"/>
+          <w:numId w:val="1006"/>
+        </w:numPr>
+      </w:pPr>
+      <w:r>
+        <w:rPr>
+          <w:b/>
+          <w:bCs/>
+        </w:rPr>
+        <w:t xml:space="preserve">Tariffs on the customs value of imports.</w:t>
+      </w:r>
+      <w:r>
+        <w:t xml:space="preserve"> </w:t>
+      </w:r>
+      <w:r>
+        <w:t xml:space="preserve">A share φ = 0.5 of the duty passes through into the</w:t>
+      </w:r>
+      <w:r>
+        <w:t xml:space="preserve"> </w:t>
+      </w:r>
+      <w:r>
+        <w:t xml:space="preserve">buyer’s (CIF) price.</w:t>
+      </w:r>
+    </w:p>
+    <w:p>
+      <w:pPr>
+        <w:pStyle w:val="Compact"/>
+        <w:numPr>
+          <w:ilvl w:val="0"/>
+          <w:numId w:val="1006"/>
+        </w:numPr>
+      </w:pPr>
+      <w:r>
+        <w:rPr>
+          <w:b/>
+          <w:bCs/>
+        </w:rPr>
+        <w:t xml:space="preserve">Income taxes at net rates</w:t>
+      </w:r>
+      <w:r>
+        <w:t xml:space="preserve">, scaled from the observed rates because the model has no transfers.</w:t>
+      </w:r>
+    </w:p>
+    <w:p>
+      <w:pPr>
+        <w:pStyle w:val="Compact"/>
+        <w:numPr>
+          <w:ilvl w:val="0"/>
+          <w:numId w:val="1006"/>
+        </w:numPr>
+      </w:pPr>
+      <w:r>
+        <w:rPr>
+          <w:b/>
+          <w:bCs/>
+        </w:rPr>
+        <w:t xml:space="preserve">Armington origin choice.</w:t>
+      </w:r>
+      <w:r>
+        <w:t xml:space="preserve"> </w:t>
+      </w:r>
+      <w:r>
+        <w:t xml:space="preserve">The split of each purchase between domestic and foreign suppliers</w:t>
+      </w:r>
+      <w:r>
+        <w:t xml:space="preserve"> </w:t>
+      </w:r>
+      <w:r>
+        <w:t xml:space="preserve">responds to relative buyer prices. The elasticities are 0.626 for final demand and 1.0 for</w:t>
+      </w:r>
+      <w:r>
+        <w:t xml:space="preserve"> </w:t>
+      </w:r>
+      <w:r>
+        <w:t xml:space="preserve">intermediate inputs; both are set by the maintainer, with no empirical estimate.</w:t>
+      </w:r>
+    </w:p>
+    <w:p>
+      <w:pPr>
+        <w:pStyle w:val="Compact"/>
+        <w:numPr>
+          <w:ilvl w:val="0"/>
+          <w:numId w:val="1006"/>
+        </w:numPr>
+      </w:pPr>
+      <w:r>
+        <w:rPr>
+          <w:b/>
+          <w:bCs/>
+        </w:rPr>
+        <w:t xml:space="preserve">Imports from the input–output structure.</w:t>
+      </w:r>
+      <w:r>
+        <w:t xml:space="preserve"> </w:t>
+      </w:r>
+      <w:r>
+        <w:t xml:space="preserve">Imports follow the input–output structure, not an</w:t>
+      </w:r>
+      <w:r>
+        <w:t xml:space="preserve"> </w:t>
+      </w:r>
+      <w:r>
+        <w:t xml:space="preserve">estimated import function.</w:t>
+      </w:r>
+    </w:p>
+    <w:p>
+      <w:pPr>
+        <w:pStyle w:val="FirstParagraph"/>
+      </w:pPr>
+      <w:r>
+        <w:rPr>
+          <w:b/>
+          <w:bCs/>
+        </w:rPr>
+        <w:t xml:space="preserve">The monetary hierarchy and the external closure</w:t>
+      </w:r>
+      <w:r>
+        <w:t xml:space="preserve"> </w:t>
+      </w:r>
+      <w:r>
+        <w:t xml:space="preserve">(Blocks 5, 10)</w:t>
+      </w:r>
+    </w:p>
+    <w:p>
+      <w:pPr>
+        <w:pStyle w:val="Compact"/>
+        <w:numPr>
+          <w:ilvl w:val="0"/>
+          <w:numId w:val="1007"/>
+        </w:numPr>
+      </w:pPr>
+      <w:r>
+        <w:rPr>
+          <w:b/>
+          <w:bCs/>
+        </w:rPr>
+        <w:t xml:space="preserve">Central banks as residual holders.</w:t>
+      </w:r>
+      <w:r>
+        <w:t xml:space="preserve"> </w:t>
+      </w:r>
+      <w:r>
+        <w:t xml:space="preserve">Each central bank is the residual holder of its own</w:t>
+      </w:r>
+      <w:r>
+        <w:t xml:space="preserve"> </w:t>
+      </w:r>
+      <w:r>
+        <w:t xml:space="preserve">government’s bills.</w:t>
+      </w:r>
+    </w:p>
+    <w:p>
+      <w:pPr>
+        <w:pStyle w:val="Compact"/>
+        <w:numPr>
+          <w:ilvl w:val="0"/>
+          <w:numId w:val="1007"/>
+        </w:numPr>
+      </w:pPr>
+      <w:r>
+        <w:rPr>
+          <w:b/>
+          <w:bCs/>
+        </w:rPr>
+        <w:t xml:space="preserve">An asymmetric reserve arrangement.</w:t>
+      </w:r>
+      <w:r>
+        <w:t xml:space="preserve"> </w:t>
+      </w:r>
+      <w:r>
+        <w:t xml:space="preserve">The EU central bank holds RoW bills; the reverse does not</w:t>
+      </w:r>
+      <w:r>
+        <w:t xml:space="preserve"> </w:t>
+      </w:r>
+      <w:r>
+        <w:t xml:space="preserve">happen.</w:t>
+      </w:r>
+    </w:p>
+    <w:p>
+      <w:pPr>
+        <w:pStyle w:val="Compact"/>
+        <w:numPr>
+          <w:ilvl w:val="0"/>
+          <w:numId w:val="1007"/>
+        </w:numPr>
+      </w:pPr>
+      <w:r>
+        <w:rPr>
+          <w:b/>
+          <w:bCs/>
+        </w:rPr>
+        <w:t xml:space="preserve">Default closure: Godley and Lavoie’s OPENFIX with gold.</w:t>
+      </w:r>
+      <w:r>
+        <w:t xml:space="preserve"> </w:t>
+      </w:r>
+      <w:r>
+        <w:t xml:space="preserve">The balance of payments settles in</w:t>
+      </w:r>
+      <w:r>
+        <w:t xml:space="preserve"> </w:t>
+      </w:r>
+      <w:r>
+        <w:t xml:space="preserve">gold.</w:t>
+      </w:r>
+    </w:p>
+    <w:p>
+      <w:pPr>
+        <w:pStyle w:val="Compact"/>
+        <w:numPr>
+          <w:ilvl w:val="0"/>
+          <w:numId w:val="1007"/>
+        </w:numPr>
+      </w:pPr>
+      <w:r>
+        <w:rPr>
+          <w:b/>
+          <w:bCs/>
+        </w:rPr>
+        <w:t xml:space="preserve">Three alternative closures run in the Results.</w:t>
+      </w:r>
+      <w:r>
+        <w:t xml:space="preserve"> </w:t>
+      </w:r>
+      <w:r>
+        <w:t xml:space="preserve">Fiat key-currency reserves; OPENFIXG, in which</w:t>
+      </w:r>
+      <w:r>
+        <w:t xml:space="preserve"> </w:t>
+      </w:r>
+      <w:r>
+        <w:t xml:space="preserve">EU government spending adjusts; and a crawling (quasi-float) exchange rate.</w:t>
+      </w:r>
+    </w:p>
+    <w:p>
+      <w:pPr>
+        <w:pStyle w:val="FirstParagraph"/>
+      </w:pPr>
+      <w:r>
+        <w:rPr>
+          <w:b/>
+          <w:bCs/>
+        </w:rPr>
+        <w:t xml:space="preserve">Ecology</w:t>
+      </w:r>
+      <w:r>
+        <w:t xml:space="preserve"> </w:t>
+      </w:r>
+      <w:r>
+        <w:t xml:space="preserve">(Blocks 11, 12)</w:t>
+      </w:r>
+    </w:p>
+    <w:p>
+      <w:pPr>
+        <w:pStyle w:val="Compact"/>
+        <w:numPr>
+          <w:ilvl w:val="0"/>
+          <w:numId w:val="1008"/>
+        </w:numPr>
+      </w:pPr>
+      <w:r>
+        <w:rPr>
+          <w:b/>
+          <w:bCs/>
+        </w:rPr>
+        <w:t xml:space="preserve">Material and energy accounts.</w:t>
+      </w:r>
+      <w:r>
+        <w:t xml:space="preserve"> </w:t>
+      </w:r>
+      <w:r>
+        <w:t xml:space="preserve">Matter extraction, energy use, and recycling are tracked.</w:t>
+      </w:r>
+      <w:r>
+        <w:t xml:space="preserve"> </w:t>
+      </w:r>
+      <w:r>
+        <w:t xml:space="preserve">Recycling counts the material content of the eight secondary-material industries.</w:t>
+      </w:r>
+    </w:p>
+    <w:p>
+      <w:pPr>
+        <w:pStyle w:val="Compact"/>
+        <w:numPr>
+          <w:ilvl w:val="0"/>
+          <w:numId w:val="1008"/>
+        </w:numPr>
+      </w:pPr>
+      <w:r>
+        <w:rPr>
+          <w:b/>
+          <w:bCs/>
+        </w:rPr>
+        <w:t xml:space="preserve">Waste.</w:t>
+      </w:r>
+      <w:r>
+        <w:t xml:space="preserve"> </w:t>
+      </w:r>
+      <w:r>
+        <w:t xml:space="preserve">Waste accumulates net of what the five waste-treatment industries absorb.</w:t>
+      </w:r>
+    </w:p>
+    <w:p>
+      <w:pPr>
+        <w:pStyle w:val="Compact"/>
+        <w:numPr>
+          <w:ilvl w:val="0"/>
+          <w:numId w:val="1008"/>
+        </w:numPr>
+      </w:pPr>
+      <w:r>
+        <w:rPr>
+          <w:b/>
+          <w:bCs/>
+        </w:rPr>
+        <w:t xml:space="preserve">Climate, land and water.</w:t>
+      </w:r>
+      <w:r>
+        <w:t xml:space="preserve"> </w:t>
+      </w:r>
+      <w:r>
+        <w:t xml:space="preserve">CO₂ emissions, cumulative emissions and temperature, land use and</w:t>
+      </w:r>
+      <w:r>
+        <w:t xml:space="preserve"> </w:t>
+      </w:r>
+      <w:r>
+        <w:t xml:space="preserve">water use are tracked.</w:t>
+      </w:r>
+    </w:p>
+    <w:p>
+      <w:pPr>
+        <w:pStyle w:val="FirstParagraph"/>
+      </w:pPr>
+      <w:r>
+        <w:rPr>
+          <w:b/>
+          <w:bCs/>
+        </w:rPr>
+        <w:t xml:space="preserve">Dynamics</w:t>
+      </w:r>
+    </w:p>
+    <w:p>
+      <w:pPr>
+        <w:pStyle w:val="Compact"/>
+        <w:numPr>
+          <w:ilvl w:val="0"/>
+          <w:numId w:val="1009"/>
+        </w:numPr>
+      </w:pPr>
+      <w:r>
+        <w:rPr>
+          <w:b/>
+          <w:bCs/>
+        </w:rPr>
+        <w:t xml:space="preserve">A damped cycle in the baseline.</w:t>
+      </w:r>
+      <w:r>
+        <w:t xml:space="preserve"> </w:t>
+      </w:r>
+      <w:r>
+        <w:t xml:space="preserve">The unshocked baseline converges to its stationary state</w:t>
+      </w:r>
+      <w:r>
+        <w:t xml:space="preserve"> </w:t>
+      </w:r>
+      <w:r>
+        <w:t xml:space="preserve">through a damped cycle, not monotonically. Turning points are about 11 periods apart (a period of</w:t>
+      </w:r>
+      <w:r>
+        <w:t xml:space="preserve"> </w:t>
+      </w:r>
+      <w:r>
+        <w:t xml:space="preserve">about 22 years), and each swing is about 0.6 of the one before. This is a multiplier–accelerator</w:t>
+      </w:r>
+      <w:r>
+        <w:t xml:space="preserve"> </w:t>
+      </w:r>
+      <w:r>
+        <w:t xml:space="preserve">cycle: it appeared with the capital stock from data (arm</w:t>
+      </w:r>
+      <w:r>
+        <w:t xml:space="preserve"> </w:t>
+      </w:r>
+      <w:r>
+        <w:rPr>
+          <w:rStyle w:val="VerbatimChar"/>
+        </w:rPr>
+        <w:t xml:space="preserve">revised_capital</w:t>
+      </w:r>
+      <w:r>
+        <w:t xml:space="preserve">), whose firm</w:t>
+      </w:r>
+      <w:r>
+        <w:t xml:space="preserve"> </w:t>
+      </w:r>
+      <w:r>
+        <w:t xml:space="preserve">capital–output ratio is about 2.8 times that of</w:t>
+      </w:r>
+      <w:r>
+        <w:t xml:space="preserve"> </w:t>
+      </w:r>
+      <w:r>
+        <w:rPr>
+          <w:rStyle w:val="VerbatimChar"/>
+        </w:rPr>
+        <w:t xml:space="preserve">revised</w:t>
+      </w:r>
+      <w:r>
+        <w:t xml:space="preserve"> </w:t>
+      </w:r>
+      <w:r>
+        <w:t xml:space="preserve">(k/VA 1.74 against 0.62 for the EU). The</w:t>
+      </w:r>
+      <w:r>
+        <w:t xml:space="preserve"> </w:t>
+      </w:r>
+      <w:r>
+        <w:t xml:space="preserve">finance, credit and high-finance additions do not change it.</w:t>
+      </w:r>
+    </w:p>
+    <w:bookmarkEnd w:id="23"/>
+    <w:bookmarkStart w:id="24" w:name="introduction"/>
     <w:p>
       <w:pPr>
         <w:pStyle w:val="Heading1"/>
@@ -727,7 +1929,7 @@
         <w:pStyle w:val="Compact"/>
         <w:numPr>
           <w:ilvl w:val="0"/>
-          <w:numId w:val="1001"/>
+          <w:numId w:val="1010"/>
         </w:numPr>
       </w:pPr>
       <w:r>
@@ -761,7 +1963,7 @@
         <w:pStyle w:val="Compact"/>
         <w:numPr>
           <w:ilvl w:val="0"/>
-          <w:numId w:val="1001"/>
+          <w:numId w:val="1010"/>
         </w:numPr>
       </w:pPr>
       <w:r>
@@ -795,7 +1997,7 @@
         <w:pStyle w:val="Compact"/>
         <w:numPr>
           <w:ilvl w:val="0"/>
-          <w:numId w:val="1001"/>
+          <w:numId w:val="1010"/>
         </w:numPr>
       </w:pPr>
       <w:r>
@@ -831,7 +2033,7 @@
         <w:pStyle w:val="Compact"/>
         <w:numPr>
           <w:ilvl w:val="1"/>
-          <w:numId w:val="1002"/>
+          <w:numId w:val="1011"/>
         </w:numPr>
       </w:pPr>
       <w:r>
@@ -849,7 +2051,7 @@
         <w:pStyle w:val="Compact"/>
         <w:numPr>
           <w:ilvl w:val="0"/>
-          <w:numId w:val="1001"/>
+          <w:numId w:val="1010"/>
         </w:numPr>
       </w:pPr>
       <w:r>
@@ -883,7 +2085,7 @@
         <w:pStyle w:val="Compact"/>
         <w:numPr>
           <w:ilvl w:val="0"/>
-          <w:numId w:val="1001"/>
+          <w:numId w:val="1010"/>
         </w:numPr>
       </w:pPr>
       <w:r>
@@ -911,7 +2113,7 @@
         <w:pStyle w:val="Compact"/>
         <w:numPr>
           <w:ilvl w:val="0"/>
-          <w:numId w:val="1001"/>
+          <w:numId w:val="1010"/>
         </w:numPr>
       </w:pPr>
       <w:r>
@@ -939,7 +2141,7 @@
         <w:pStyle w:val="Compact"/>
         <w:numPr>
           <w:ilvl w:val="0"/>
-          <w:numId w:val="1001"/>
+          <w:numId w:val="1010"/>
         </w:numPr>
       </w:pPr>
       <w:r>
@@ -1041,7 +2243,7 @@
         <w:pStyle w:val="Compact"/>
         <w:numPr>
           <w:ilvl w:val="0"/>
-          <w:numId w:val="1001"/>
+          <w:numId w:val="1010"/>
         </w:numPr>
       </w:pPr>
       <w:r>
@@ -1087,7 +2289,7 @@
         <w:pStyle w:val="Compact"/>
         <w:numPr>
           <w:ilvl w:val="0"/>
-          <w:numId w:val="1001"/>
+          <w:numId w:val="1010"/>
         </w:numPr>
       </w:pPr>
       <w:r>
@@ -1115,7 +2317,7 @@
         <w:pStyle w:val="Compact"/>
         <w:numPr>
           <w:ilvl w:val="0"/>
-          <w:numId w:val="1001"/>
+          <w:numId w:val="1010"/>
         </w:numPr>
       </w:pPr>
       <w:r>
@@ -1138,8 +2340,8 @@
         <w:t xml:space="preserve">asset’s return instead of last period’s realised return, with a larger scale σ = 4.</w:t>
       </w:r>
     </w:p>
-    <w:bookmarkEnd w:id="23"/>
-    <w:bookmarkStart w:id="24" w:name="block-0.-initial-state"/>
+    <w:bookmarkEnd w:id="24"/>
+    <w:bookmarkStart w:id="25" w:name="block-0.-initial-state"/>
     <w:p>
       <w:pPr>
         <w:pStyle w:val="Heading1"/>
@@ -1347,8 +2549,8 @@
         <w:t xml:space="preserve">workbook, not from the run.</w:t>
       </w:r>
     </w:p>
-    <w:bookmarkEnd w:id="24"/>
-    <w:bookmarkStart w:id="25" w:name="block-1.-households"/>
+    <w:bookmarkEnd w:id="25"/>
+    <w:bookmarkStart w:id="26" w:name="block-1.-households"/>
     <w:p>
       <w:pPr>
         <w:pStyle w:val="Heading1"/>
@@ -3582,8 +4784,8 @@
         </m:oMath>
       </m:oMathPara>
     </w:p>
-    <w:bookmarkEnd w:id="25"/>
-    <w:bookmarkStart w:id="26" w:name="X17ebe9e88a800117379fad768b38e3f2f3158c5"/>
+    <w:bookmarkEnd w:id="26"/>
+    <w:bookmarkStart w:id="27" w:name="X17ebe9e88a800117379fad768b38e3f2f3158c5"/>
     <w:p>
       <w:pPr>
         <w:pStyle w:val="Heading1"/>
@@ -7373,8 +8575,8 @@
         <w:t xml:space="preserve">assets without bound.</w:t>
       </w:r>
     </w:p>
-    <w:bookmarkEnd w:id="26"/>
-    <w:bookmarkStart w:id="27" w:name="X999cdbe03feabe4129b98495a55eb8ed9cc657b"/>
+    <w:bookmarkEnd w:id="27"/>
+    <w:bookmarkStart w:id="28" w:name="X999cdbe03feabe4129b98495a55eb8ed9cc657b"/>
     <w:p>
       <w:pPr>
         <w:pStyle w:val="Heading1"/>
@@ -11838,8 +13040,8 @@
         <w:t xml:space="preserve">floating rate it leaked gold out of the world balance.</w:t>
       </w:r>
     </w:p>
-    <w:bookmarkEnd w:id="27"/>
-    <w:bookmarkStart w:id="28" w:name="block-4.-commercial-banks"/>
+    <w:bookmarkEnd w:id="28"/>
+    <w:bookmarkStart w:id="29" w:name="block-4.-commercial-banks"/>
     <w:p>
       <w:pPr>
         <w:pStyle w:val="Heading1"/>
@@ -12669,8 +13871,8 @@
         </m:oMath>
       </m:oMathPara>
     </w:p>
-    <w:bookmarkEnd w:id="28"/>
-    <w:bookmarkStart w:id="29" w:name="block-5.-government-and-central-bank"/>
+    <w:bookmarkEnd w:id="29"/>
+    <w:bookmarkStart w:id="30" w:name="block-5.-government-and-central-bank"/>
     <w:p>
       <w:pPr>
         <w:pStyle w:val="Heading1"/>
@@ -16816,8 +18018,8 @@
         </m:oMath>
       </m:oMathPara>
     </w:p>
-    <w:bookmarkEnd w:id="29"/>
-    <w:bookmarkStart w:id="30" w:name="X06d20eb2f32f35acb95fbe1b0a352f0bd777a0c"/>
+    <w:bookmarkEnd w:id="30"/>
+    <w:bookmarkStart w:id="31" w:name="X06d20eb2f32f35acb95fbe1b0a352f0bd777a0c"/>
     <w:p>
       <w:pPr>
         <w:pStyle w:val="Heading1"/>
@@ -18576,8 +19778,8 @@
         <w:t xml:space="preserve">−43% in RoW over a run).</w:t>
       </w:r>
     </w:p>
-    <w:bookmarkEnd w:id="30"/>
-    <w:bookmarkStart w:id="31" w:name="block-7.-portfolio-choices"/>
+    <w:bookmarkEnd w:id="31"/>
+    <w:bookmarkStart w:id="32" w:name="block-7.-portfolio-choices"/>
     <w:p>
       <w:pPr>
         <w:pStyle w:val="Heading1"/>
@@ -20401,7 +21603,7 @@
         <w:pStyle w:val="Compact"/>
         <w:numPr>
           <w:ilvl w:val="0"/>
-          <w:numId w:val="1003"/>
+          <w:numId w:val="1012"/>
         </w:numPr>
       </w:pPr>
       <m:oMath>
@@ -20675,7 +21877,7 @@
         <w:pStyle w:val="Compact"/>
         <w:numPr>
           <w:ilvl w:val="0"/>
-          <w:numId w:val="1003"/>
+          <w:numId w:val="1012"/>
         </w:numPr>
       </w:pPr>
       <m:oMath>
@@ -20746,7 +21948,7 @@
         <w:pStyle w:val="Compact"/>
         <w:numPr>
           <w:ilvl w:val="0"/>
-          <w:numId w:val="1003"/>
+          <w:numId w:val="1012"/>
         </w:numPr>
       </w:pPr>
       <m:oMath>
@@ -21035,7 +22237,7 @@
         <w:pStyle w:val="Compact"/>
         <w:numPr>
           <w:ilvl w:val="0"/>
-          <w:numId w:val="1004"/>
+          <w:numId w:val="1013"/>
         </w:numPr>
       </w:pPr>
       <w:r>
@@ -21047,7 +22249,7 @@
         <w:pStyle w:val="Compact"/>
         <w:numPr>
           <w:ilvl w:val="0"/>
-          <w:numId w:val="1004"/>
+          <w:numId w:val="1013"/>
         </w:numPr>
       </w:pPr>
       <w:r>
@@ -21059,7 +22261,7 @@
         <w:pStyle w:val="Compact"/>
         <w:numPr>
           <w:ilvl w:val="0"/>
-          <w:numId w:val="1004"/>
+          <w:numId w:val="1013"/>
         </w:numPr>
       </w:pPr>
       <w:r>
@@ -21071,7 +22273,7 @@
         <w:pStyle w:val="Compact"/>
         <w:numPr>
           <w:ilvl w:val="0"/>
-          <w:numId w:val="1004"/>
+          <w:numId w:val="1013"/>
         </w:numPr>
       </w:pPr>
       <w:r>
@@ -21097,7 +22299,7 @@
         <w:pStyle w:val="Compact"/>
         <w:numPr>
           <w:ilvl w:val="0"/>
-          <w:numId w:val="1005"/>
+          <w:numId w:val="1014"/>
         </w:numPr>
       </w:pPr>
       <w:r>
@@ -21125,7 +22327,7 @@
         <w:pStyle w:val="Compact"/>
         <w:numPr>
           <w:ilvl w:val="0"/>
-          <w:numId w:val="1005"/>
+          <w:numId w:val="1014"/>
         </w:numPr>
       </w:pPr>
       <w:r>
@@ -21916,8 +23118,8 @@
         </m:oMath>
       </m:oMathPara>
     </w:p>
-    <w:bookmarkEnd w:id="31"/>
-    <w:bookmarkStart w:id="32" w:name="Xa686f52e79bb6471cc7782a819a8c9948b7de52"/>
+    <w:bookmarkEnd w:id="32"/>
+    <w:bookmarkStart w:id="33" w:name="Xa686f52e79bb6471cc7782a819a8c9948b7de52"/>
     <w:p>
       <w:pPr>
         <w:pStyle w:val="Heading1"/>
@@ -25251,8 +26453,8 @@
         <w:t xml:space="preserve">government investment.</w:t>
       </w:r>
     </w:p>
-    <w:bookmarkEnd w:id="32"/>
-    <w:bookmarkStart w:id="33" w:name="block-9.-the-balance-of-payments"/>
+    <w:bookmarkEnd w:id="33"/>
+    <w:bookmarkStart w:id="34" w:name="block-9.-the-balance-of-payments"/>
     <w:p>
       <w:pPr>
         <w:pStyle w:val="Heading1"/>
@@ -28428,8 +29630,8 @@
         <w:t xml:space="preserve">converted at the current exchange rate, as in (1.2).</w:t>
       </w:r>
     </w:p>
-    <w:bookmarkEnd w:id="33"/>
-    <w:bookmarkStart w:id="34" w:name="block-10.-exchange-rate-closure"/>
+    <w:bookmarkEnd w:id="34"/>
+    <w:bookmarkStart w:id="35" w:name="block-10.-exchange-rate-closure"/>
     <w:p>
       <w:pPr>
         <w:pStyle w:val="Heading1"/>
@@ -30486,8 +31688,8 @@
         <w:t xml:space="preserve">and each central bank’s interest stays within its own area.</w:t>
       </w:r>
     </w:p>
-    <w:bookmarkEnd w:id="34"/>
-    <w:bookmarkStart w:id="35" w:name="block-11.-waste-emissions"/>
+    <w:bookmarkEnd w:id="35"/>
+    <w:bookmarkStart w:id="36" w:name="block-11.-waste-emissions"/>
     <w:p>
       <w:pPr>
         <w:pStyle w:val="Heading1"/>
@@ -31738,8 +32940,8 @@
         </m:oMath>
       </m:oMathPara>
     </w:p>
-    <w:bookmarkEnd w:id="35"/>
-    <w:bookmarkStart w:id="36" w:name="X7970694e3a2847dd90849b4fb35f95ea62a0963"/>
+    <w:bookmarkEnd w:id="36"/>
+    <w:bookmarkStart w:id="37" w:name="X7970694e3a2847dd90849b4fb35f95ea62a0963"/>
     <w:p>
       <w:pPr>
         <w:pStyle w:val="Heading1"/>
@@ -33571,8 +34773,8 @@
         <w:t xml:space="preserve">and the oxygen used in production (12.16, 12.17).</w:t>
       </w:r>
     </w:p>
-    <w:bookmarkEnd w:id="36"/>
-    <w:bookmarkStart w:id="37" w:name="block-13.-circular-economy-innovations"/>
+    <w:bookmarkEnd w:id="37"/>
+    <w:bookmarkStart w:id="38" w:name="block-13.-circular-economy-innovations"/>
     <w:p>
       <w:pPr>
         <w:pStyle w:val="Heading1"/>
@@ -34714,7 +35916,7 @@
         <w:pStyle w:val="Compact"/>
         <w:numPr>
           <w:ilvl w:val="0"/>
-          <w:numId w:val="1006"/>
+          <w:numId w:val="1015"/>
         </w:numPr>
       </w:pPr>
       <w:r>
@@ -34801,7 +36003,7 @@
         <w:pStyle w:val="Compact"/>
         <w:numPr>
           <w:ilvl w:val="0"/>
-          <w:numId w:val="1006"/>
+          <w:numId w:val="1015"/>
         </w:numPr>
       </w:pPr>
       <w:r>
@@ -34844,7 +36046,7 @@
         <w:pStyle w:val="Compact"/>
         <w:numPr>
           <w:ilvl w:val="0"/>
-          <w:numId w:val="1006"/>
+          <w:numId w:val="1015"/>
         </w:numPr>
       </w:pPr>
       <w:r>
@@ -34894,7 +36096,7 @@
         <w:pStyle w:val="Compact"/>
         <w:numPr>
           <w:ilvl w:val="0"/>
-          <w:numId w:val="1006"/>
+          <w:numId w:val="1015"/>
         </w:numPr>
       </w:pPr>
       <w:r>
@@ -34917,8 +36119,8 @@
         <w:t xml:space="preserve">appreciation lowers the trade balance in every run. There is no empirical estimate behind it.</w:t>
       </w:r>
     </w:p>
-    <w:bookmarkEnd w:id="37"/>
-    <w:bookmarkStart w:id="43" w:name="Xa601e4ccdbc1899f934714e797fdb395b5f1e53"/>
+    <w:bookmarkEnd w:id="38"/>
+    <w:bookmarkStart w:id="44" w:name="Xa601e4ccdbc1899f934714e797fdb395b5f1e53"/>
     <w:p>
       <w:pPr>
         <w:pStyle w:val="Heading1"/>
@@ -35334,7 +36536,7 @@
         <w:t xml:space="preserve">and OPENFIXR, which was specified and not built. Both are described at the end of this section.</w:t>
       </w:r>
     </w:p>
-    <w:bookmarkStart w:id="38" w:name="X301bcd23a298caa47149f5ce740ee81cbf435ff"/>
+    <w:bookmarkStart w:id="39" w:name="X301bcd23a298caa47149f5ce740ee81cbf435ff"/>
     <w:p>
       <w:pPr>
         <w:pStyle w:val="Heading2"/>
@@ -36357,8 +37559,8 @@
         <w:t xml:space="preserve">is OPENFIXR (below).</w:t>
       </w:r>
     </w:p>
-    <w:bookmarkEnd w:id="38"/>
-    <w:bookmarkStart w:id="39" w:name="openfixg-government-spending-reacts"/>
+    <w:bookmarkEnd w:id="39"/>
+    <w:bookmarkStart w:id="40" w:name="openfixg-government-spending-reacts"/>
     <w:p>
       <w:pPr>
         <w:pStyle w:val="Heading2"/>
@@ -37336,8 +38538,8 @@
         <w:t xml:space="preserve">holdings are frozen and gold settles, so no area’s money plays that role, and those closures are neutral.</w:t>
       </w:r>
     </w:p>
-    <w:bookmarkEnd w:id="39"/>
-    <w:bookmarkStart w:id="40" w:name="quasi-float-a-crawling-exchange-rate"/>
+    <w:bookmarkEnd w:id="40"/>
+    <w:bookmarkStart w:id="41" w:name="quasi-float-a-crawling-exchange-rate"/>
     <w:p>
       <w:pPr>
         <w:pStyle w:val="Heading2"/>
@@ -37575,8 +38777,8 @@
         <w:t xml:space="preserve">trade balance, and the rate diverges.</w:t>
       </w:r>
     </w:p>
-    <w:bookmarkEnd w:id="40"/>
-    <w:bookmarkStart w:id="41" w:name="X2f42741fb56e3e8ef4038a650aecd880a4e554c"/>
+    <w:bookmarkEnd w:id="41"/>
+    <w:bookmarkStart w:id="42" w:name="X2f42741fb56e3e8ef4038a650aecd880a4e554c"/>
     <w:p>
       <w:pPr>
         <w:pStyle w:val="Heading2"/>
@@ -37948,7 +39150,7 @@
         <w:pStyle w:val="Compact"/>
         <w:numPr>
           <w:ilvl w:val="0"/>
-          <w:numId w:val="1007"/>
+          <w:numId w:val="1016"/>
         </w:numPr>
       </w:pPr>
       <w:r>
@@ -38020,7 +39222,7 @@
         <w:pStyle w:val="Compact"/>
         <w:numPr>
           <w:ilvl w:val="0"/>
-          <w:numId w:val="1007"/>
+          <w:numId w:val="1016"/>
         </w:numPr>
       </w:pPr>
       <w:r>
@@ -38292,8 +39494,8 @@
         <w:t xml:space="preserve">) are being tested next.</w:t>
       </w:r>
     </w:p>
-    <w:bookmarkEnd w:id="41"/>
-    <w:bookmarkStart w:id="42" w:name="openfixr-specified-not-built"/>
+    <w:bookmarkEnd w:id="42"/>
+    <w:bookmarkStart w:id="43" w:name="openfixr-specified-not-built"/>
     <w:p>
       <w:pPr>
         <w:pStyle w:val="Heading2"/>
@@ -38399,9 +39601,9 @@
         <w:t xml:space="preserve">the circular-economy shock with the closure’s runaway.</w:t>
       </w:r>
     </w:p>
-    <w:bookmarkEnd w:id="42"/>
     <w:bookmarkEnd w:id="43"/>
-    <w:bookmarkStart w:id="44" w:name="calibration"/>
+    <w:bookmarkEnd w:id="44"/>
+    <w:bookmarkStart w:id="45" w:name="calibration"/>
     <w:p>
       <w:pPr>
         <w:pStyle w:val="Heading1"/>
@@ -39227,7 +40429,7 @@
         <w:pStyle w:val="Compact"/>
         <w:numPr>
           <w:ilvl w:val="0"/>
-          <w:numId w:val="1008"/>
+          <w:numId w:val="1017"/>
         </w:numPr>
       </w:pPr>
       <w:r>
@@ -39239,7 +40441,7 @@
         <w:pStyle w:val="Compact"/>
         <w:numPr>
           <w:ilvl w:val="0"/>
-          <w:numId w:val="1008"/>
+          <w:numId w:val="1017"/>
         </w:numPr>
       </w:pPr>
       <w:r>
@@ -39333,7 +40535,7 @@
         <w:pStyle w:val="Compact"/>
         <w:numPr>
           <w:ilvl w:val="0"/>
-          <w:numId w:val="1008"/>
+          <w:numId w:val="1017"/>
         </w:numPr>
       </w:pPr>
       <w:r>
@@ -39345,7 +40547,7 @@
         <w:pStyle w:val="Compact"/>
         <w:numPr>
           <w:ilvl w:val="0"/>
-          <w:numId w:val="1008"/>
+          <w:numId w:val="1017"/>
         </w:numPr>
       </w:pPr>
       <w:r>
@@ -39803,8 +41005,8 @@
         <w:t xml:space="preserve">(decisions D-53 to D-55 and D-59), with debt/VA targets from the IMF (0.979 North, 0.363 South).</w:t>
       </w:r>
     </w:p>
-    <w:bookmarkEnd w:id="44"/>
-    <w:bookmarkStart w:id="45" w:name="provenance"/>
+    <w:bookmarkEnd w:id="45"/>
+    <w:bookmarkStart w:id="46" w:name="provenance"/>
     <w:p>
       <w:pPr>
         <w:pStyle w:val="Heading1"/>
@@ -39818,7 +41020,7 @@
         <w:pStyle w:val="Compact"/>
         <w:numPr>
           <w:ilvl w:val="0"/>
-          <w:numId w:val="1009"/>
+          <w:numId w:val="1018"/>
         </w:numPr>
       </w:pPr>
       <w:r>
@@ -39939,7 +41141,7 @@
         <w:pStyle w:val="Compact"/>
         <w:numPr>
           <w:ilvl w:val="0"/>
-          <w:numId w:val="1009"/>
+          <w:numId w:val="1018"/>
         </w:numPr>
       </w:pPr>
       <w:r>
@@ -39997,7 +41199,7 @@
         <w:pStyle w:val="Compact"/>
         <w:numPr>
           <w:ilvl w:val="0"/>
-          <w:numId w:val="1009"/>
+          <w:numId w:val="1018"/>
         </w:numPr>
       </w:pPr>
       <w:r>
@@ -40076,7 +41278,7 @@
         <w:pStyle w:val="Compact"/>
         <w:numPr>
           <w:ilvl w:val="0"/>
-          <w:numId w:val="1009"/>
+          <w:numId w:val="1018"/>
         </w:numPr>
       </w:pPr>
       <w:r>
@@ -40143,7 +41345,7 @@
         <w:pStyle w:val="Compact"/>
         <w:numPr>
           <w:ilvl w:val="0"/>
-          <w:numId w:val="1009"/>
+          <w:numId w:val="1018"/>
         </w:numPr>
       </w:pPr>
       <w:r>
@@ -40221,7 +41423,7 @@
         <w:t xml:space="preserve">.</w:t>
       </w:r>
     </w:p>
-    <w:bookmarkEnd w:id="45"/>
+    <w:bookmarkEnd w:id="46"/>
     <w:sectPr>
       <w:footnotePr>
         <w:numRestart w:val="eachSect"/>
@@ -40332,6 +41534,109 @@
       </w:pPr>
     </w:lvl>
   </w:abstractNum>
+  <w:abstractNum w:abstractNumId="991">
+    <w:nsid w:val="0000A991"/>
+    <w:multiLevelType w:val="multilevel"/>
+    <w:lvl w:ilvl="0">
+      <w:numFmt w:val="bullet"/>
+      <w:lvlText w:val=""/>
+      <w:lvlJc w:val="left"/>
+      <w:pPr>
+        <w:ind w:left="720" w:hanging="360"/>
+      </w:pPr>
+      <w:rPr>
+        <w:rFonts w:ascii="Symbol" w:hAnsi="Symbol" w:cs="Symbol" w:hint="default"/>
+      </w:rPr>
+    </w:lvl>
+    <w:lvl w:ilvl="1">
+      <w:numFmt w:val="bullet"/>
+      <w:lvlText w:val="o"/>
+      <w:lvlJc w:val="left"/>
+      <w:pPr>
+        <w:ind w:left="1440" w:hanging="360"/>
+      </w:pPr>
+      <w:rPr>
+        <w:rFonts w:ascii="Courier New" w:hAnsi="Courier New" w:cs="Courier New" w:hint="default"/>
+      </w:rPr>
+    </w:lvl>
+    <w:lvl w:ilvl="2">
+      <w:numFmt w:val="bullet"/>
+      <w:lvlText w:val=""/>
+      <w:lvlJc w:val="left"/>
+      <w:pPr>
+        <w:ind w:left="2160" w:hanging="360"/>
+      </w:pPr>
+      <w:rPr>
+        <w:rFonts w:ascii="Wingdings" w:hAnsi="Wingdings" w:cs="Wingdings" w:hint="default"/>
+      </w:rPr>
+    </w:lvl>
+    <w:lvl w:ilvl="3">
+      <w:numFmt w:val="bullet"/>
+      <w:lvlText w:val=""/>
+      <w:lvlJc w:val="left"/>
+      <w:pPr>
+        <w:ind w:left="2880" w:hanging="360"/>
+      </w:pPr>
+      <w:rPr>
+        <w:rFonts w:ascii="Symbol" w:hAnsi="Symbol" w:cs="Symbol" w:hint="default"/>
+      </w:rPr>
+    </w:lvl>
+    <w:lvl w:ilvl="4">
+      <w:numFmt w:val="bullet"/>
+      <w:lvlText w:val="o"/>
+      <w:lvlJc w:val="left"/>
+      <w:pPr>
+        <w:ind w:left="3600" w:hanging="360"/>
+      </w:pPr>
+      <w:rPr>
+        <w:rFonts w:ascii="Courier New" w:hAnsi="Courier New" w:cs="Courier New" w:hint="default"/>
+      </w:rPr>
+    </w:lvl>
+    <w:lvl w:ilvl="5">
+      <w:numFmt w:val="bullet"/>
+      <w:lvlText w:val=""/>
+      <w:lvlJc w:val="left"/>
+      <w:pPr>
+        <w:ind w:left="4320" w:hanging="360"/>
+      </w:pPr>
+      <w:rPr>
+        <w:rFonts w:ascii="Wingdings" w:hAnsi="Wingdings" w:cs="Wingdings" w:hint="default"/>
+      </w:rPr>
+    </w:lvl>
+    <w:lvl w:ilvl="6">
+      <w:numFmt w:val="bullet"/>
+      <w:lvlText w:val=""/>
+      <w:lvlJc w:val="left"/>
+      <w:pPr>
+        <w:ind w:left="5040" w:hanging="360"/>
+      </w:pPr>
+      <w:rPr>
+        <w:rFonts w:ascii="Symbol" w:hAnsi="Symbol" w:cs="Symbol" w:hint="default"/>
+      </w:rPr>
+    </w:lvl>
+    <w:lvl w:ilvl="7">
+      <w:numFmt w:val="bullet"/>
+      <w:lvlText w:val="o"/>
+      <w:lvlJc w:val="left"/>
+      <w:pPr>
+        <w:ind w:left="5760" w:hanging="360"/>
+      </w:pPr>
+      <w:rPr>
+        <w:rFonts w:ascii="Courier New" w:hAnsi="Courier New" w:cs="Courier New" w:hint="default"/>
+      </w:rPr>
+    </w:lvl>
+    <w:lvl w:ilvl="8">
+      <w:numFmt w:val="bullet"/>
+      <w:lvlText w:val=""/>
+      <w:lvlJc w:val="left"/>
+      <w:pPr>
+        <w:ind w:left="6480" w:hanging="360"/>
+      </w:pPr>
+      <w:rPr>
+        <w:rFonts w:ascii="Wingdings" w:hAnsi="Wingdings" w:cs="Wingdings" w:hint="default"/>
+      </w:rPr>
+    </w:lvl>
+  </w:abstractNum>
   <w:abstractNum w:abstractNumId="99411">
     <w:nsid w:val="00A99411"/>
     <w:multiLevelType w:val="multilevel"/>
@@ -40502,113 +41807,37 @@
       </w:pPr>
     </w:lvl>
   </w:abstractNum>
-  <w:abstractNum w:abstractNumId="991">
-    <w:nsid w:val="0000A991"/>
-    <w:multiLevelType w:val="multilevel"/>
-    <w:lvl w:ilvl="0">
-      <w:numFmt w:val="bullet"/>
-      <w:lvlText w:val=""/>
-      <w:lvlJc w:val="left"/>
-      <w:pPr>
-        <w:ind w:left="720" w:hanging="360"/>
-      </w:pPr>
-      <w:rPr>
-        <w:rFonts w:ascii="Symbol" w:hAnsi="Symbol" w:cs="Symbol" w:hint="default"/>
-      </w:rPr>
-    </w:lvl>
-    <w:lvl w:ilvl="1">
-      <w:numFmt w:val="bullet"/>
-      <w:lvlText w:val="o"/>
-      <w:lvlJc w:val="left"/>
-      <w:pPr>
-        <w:ind w:left="1440" w:hanging="360"/>
-      </w:pPr>
-      <w:rPr>
-        <w:rFonts w:ascii="Courier New" w:hAnsi="Courier New" w:cs="Courier New" w:hint="default"/>
-      </w:rPr>
-    </w:lvl>
-    <w:lvl w:ilvl="2">
-      <w:numFmt w:val="bullet"/>
-      <w:lvlText w:val=""/>
-      <w:lvlJc w:val="left"/>
-      <w:pPr>
-        <w:ind w:left="2160" w:hanging="360"/>
-      </w:pPr>
-      <w:rPr>
-        <w:rFonts w:ascii="Wingdings" w:hAnsi="Wingdings" w:cs="Wingdings" w:hint="default"/>
-      </w:rPr>
-    </w:lvl>
-    <w:lvl w:ilvl="3">
-      <w:numFmt w:val="bullet"/>
-      <w:lvlText w:val=""/>
-      <w:lvlJc w:val="left"/>
-      <w:pPr>
-        <w:ind w:left="2880" w:hanging="360"/>
-      </w:pPr>
-      <w:rPr>
-        <w:rFonts w:ascii="Symbol" w:hAnsi="Symbol" w:cs="Symbol" w:hint="default"/>
-      </w:rPr>
-    </w:lvl>
-    <w:lvl w:ilvl="4">
-      <w:numFmt w:val="bullet"/>
-      <w:lvlText w:val="o"/>
-      <w:lvlJc w:val="left"/>
-      <w:pPr>
-        <w:ind w:left="3600" w:hanging="360"/>
-      </w:pPr>
-      <w:rPr>
-        <w:rFonts w:ascii="Courier New" w:hAnsi="Courier New" w:cs="Courier New" w:hint="default"/>
-      </w:rPr>
-    </w:lvl>
-    <w:lvl w:ilvl="5">
-      <w:numFmt w:val="bullet"/>
-      <w:lvlText w:val=""/>
-      <w:lvlJc w:val="left"/>
-      <w:pPr>
-        <w:ind w:left="4320" w:hanging="360"/>
-      </w:pPr>
-      <w:rPr>
-        <w:rFonts w:ascii="Wingdings" w:hAnsi="Wingdings" w:cs="Wingdings" w:hint="default"/>
-      </w:rPr>
-    </w:lvl>
-    <w:lvl w:ilvl="6">
-      <w:numFmt w:val="bullet"/>
-      <w:lvlText w:val=""/>
-      <w:lvlJc w:val="left"/>
-      <w:pPr>
-        <w:ind w:left="5040" w:hanging="360"/>
-      </w:pPr>
-      <w:rPr>
-        <w:rFonts w:ascii="Symbol" w:hAnsi="Symbol" w:cs="Symbol" w:hint="default"/>
-      </w:rPr>
-    </w:lvl>
-    <w:lvl w:ilvl="7">
-      <w:numFmt w:val="bullet"/>
-      <w:lvlText w:val="o"/>
-      <w:lvlJc w:val="left"/>
-      <w:pPr>
-        <w:ind w:left="5760" w:hanging="360"/>
-      </w:pPr>
-      <w:rPr>
-        <w:rFonts w:ascii="Courier New" w:hAnsi="Courier New" w:cs="Courier New" w:hint="default"/>
-      </w:rPr>
-    </w:lvl>
-    <w:lvl w:ilvl="8">
-      <w:numFmt w:val="bullet"/>
-      <w:lvlText w:val=""/>
-      <w:lvlJc w:val="left"/>
-      <w:pPr>
-        <w:ind w:left="6480" w:hanging="360"/>
-      </w:pPr>
-      <w:rPr>
-        <w:rFonts w:ascii="Wingdings" w:hAnsi="Wingdings" w:cs="Wingdings" w:hint="default"/>
-      </w:rPr>
-    </w:lvl>
-  </w:abstractNum>
   <w:num w:numId="1000">
     <w:abstractNumId w:val="990"/>
   </w:num>
   <w:num w:numId="1001">
+    <w:abstractNumId w:val="991"/>
+  </w:num>
+  <w:num w:numId="1002">
+    <w:abstractNumId w:val="991"/>
+  </w:num>
+  <w:num w:numId="1003">
+    <w:abstractNumId w:val="991"/>
+  </w:num>
+  <w:num w:numId="1004">
+    <w:abstractNumId w:val="991"/>
+  </w:num>
+  <w:num w:numId="1005">
+    <w:abstractNumId w:val="991"/>
+  </w:num>
+  <w:num w:numId="1006">
+    <w:abstractNumId w:val="991"/>
+  </w:num>
+  <w:num w:numId="1007">
+    <w:abstractNumId w:val="991"/>
+  </w:num>
+  <w:num w:numId="1008">
+    <w:abstractNumId w:val="991"/>
+  </w:num>
+  <w:num w:numId="1009">
+    <w:abstractNumId w:val="991"/>
+  </w:num>
+  <w:num w:numId="1010">
     <w:abstractNumId w:val="99411"/>
     <w:lvlOverride w:ilvl="0">
       <w:startOverride w:val="1"/>
@@ -40638,7 +41867,7 @@
       <w:startOverride w:val="1"/>
     </w:lvlOverride>
   </w:num>
-  <w:num w:numId="1002">
+  <w:num w:numId="1011">
     <w:abstractNumId w:val="99422011"/>
     <w:lvlOverride w:ilvl="0">
       <w:startOverride w:val="2011"/>
@@ -40668,25 +41897,25 @@
       <w:startOverride w:val="2011"/>
     </w:lvlOverride>
   </w:num>
-  <w:num w:numId="1003">
+  <w:num w:numId="1012">
     <w:abstractNumId w:val="991"/>
   </w:num>
-  <w:num w:numId="1004">
+  <w:num w:numId="1013">
     <w:abstractNumId w:val="991"/>
   </w:num>
-  <w:num w:numId="1005">
+  <w:num w:numId="1014">
     <w:abstractNumId w:val="991"/>
   </w:num>
-  <w:num w:numId="1006">
+  <w:num w:numId="1015">
     <w:abstractNumId w:val="991"/>
   </w:num>
-  <w:num w:numId="1007">
+  <w:num w:numId="1016">
     <w:abstractNumId w:val="991"/>
   </w:num>
-  <w:num w:numId="1008">
+  <w:num w:numId="1017">
     <w:abstractNumId w:val="991"/>
   </w:num>
-  <w:num w:numId="1009">
+  <w:num w:numId="1018">
     <w:abstractNumId w:val="991"/>
   </w:num>
 </w:numbering>

</xml_diff>